<commit_message>
Handoff: product-image gallery setting; socks template added to live-ready
Co-Authored-By: Claude Opus 5.5 <noreply@anthropic.com>
Claude-Session: https://claude.ai/code/session_01YUaqMprd9jDWbjH8Lh4n9H
</commit_message>
<xml_diff>
--- a/handoff/MUTO_Dev_Handoff_12Oct2026.docx
+++ b/handoff/MUTO_Dev_Handoff_12Oct2026.docx
@@ -69,7 +69,7 @@
           <w:bCs/>
           <w:b/>
         </w:rPr>
-        <w:t xml:space="preserve">7 files</w:t>
+        <w:t xml:space="preserve">8 files</w:t>
       </w:r>
       <w:r>
         <w:t xml:space="preserve">, all in</w:t>
@@ -156,7 +156,7 @@
         </w:r>
       </w:hyperlink>
       <w:r>
-        <w:t xml:space="preserve">. It now holds only the 7 files still to copy, at their theme paths.</w:t>
+        <w:t xml:space="preserve">. It now holds only the 8 files still to copy, at their theme paths.</w:t>
       </w:r>
     </w:p>
     <w:p>
@@ -200,7 +200,7 @@
         <w:t xml:space="preserve"> </w:t>
       </w:r>
       <w:r>
-        <w:t xml:space="preserve">on 12 Oct I compared each live-ready file with the live theme. 8 were identical, so they’re done and were removed from the folder. The 7 left are below.</w:t>
+        <w:t xml:space="preserve">on 12 Oct I compared each live-ready file with the live theme. 8 were identical, so they’re done and were removed from the folder. What’s left is below.</w:t>
       </w:r>
     </w:p>
     <w:p>
@@ -421,13 +421,13 @@
       </w:r>
     </w:p>
     <w:bookmarkEnd w:id="23"/>
-    <w:bookmarkStart w:id="24" w:name="the-7-files-to-copy"/>
+    <w:bookmarkStart w:id="24" w:name="the-8-files-to-copy"/>
     <w:p>
       <w:pPr>
         <w:pStyle w:val="Heading1"/>
       </w:pPr>
       <w:r>
-        <w:t xml:space="preserve">The 7 files to copy</w:t>
+        <w:t xml:space="preserve">The 8 files to copy</w:t>
       </w:r>
     </w:p>
     <w:tbl>
@@ -936,15 +936,100 @@
           </w:p>
         </w:tc>
       </w:tr>
+      <w:tr>
+        <w:tc>
+          <w:tcPr/>
+          <w:p>
+            <w:pPr>
+              <w:pStyle w:val="Compact"/>
+              <w:jc w:val="left"/>
+            </w:pPr>
+            <w:r>
+              <w:rPr>
+                <w:rStyle w:val="VerbatimChar"/>
+              </w:rPr>
+              <w:t xml:space="preserve">templates/product.muto-socks.json</w:t>
+            </w:r>
+          </w:p>
+        </w:tc>
+        <w:tc>
+          <w:tcPr/>
+          <w:p>
+            <w:pPr>
+              <w:pStyle w:val="Compact"/>
+              <w:jc w:val="left"/>
+            </w:pPr>
+            <w:r>
+              <w:t xml:space="preserve">Socks product page</w:t>
+            </w:r>
+          </w:p>
+        </w:tc>
+        <w:tc>
+          <w:tcPr/>
+          <w:p>
+            <w:pPr>
+              <w:pStyle w:val="Compact"/>
+              <w:jc w:val="left"/>
+            </w:pPr>
+            <w:r>
+              <w:t xml:space="preserve">Only change:</w:t>
+            </w:r>
+            <w:r>
+              <w:t xml:space="preserve"> </w:t>
+            </w:r>
+            <w:r>
+              <w:t xml:space="preserve">“</w:t>
+            </w:r>
+            <w:r>
+              <w:t xml:space="preserve">Use the product’s own images</w:t>
+            </w:r>
+            <w:r>
+              <w:t xml:space="preserve">”</w:t>
+            </w:r>
+            <w:r>
+              <w:t xml:space="preserve"> </w:t>
+            </w:r>
+            <w:r>
+              <w:t xml:space="preserve">switched on (see below).</w:t>
+            </w:r>
+          </w:p>
+        </w:tc>
+      </w:tr>
     </w:tbl>
+    <w:p>
+      <w:pPr>
+        <w:pStyle w:val="BodyText"/>
+      </w:pPr>
+      <w:r>
+        <w:t xml:space="preserve">Every product template in this folder also has</w:t>
+      </w:r>
+      <w:r>
+        <w:t xml:space="preserve"> </w:t>
+      </w:r>
+      <w:r>
+        <w:t xml:space="preserve">“</w:t>
+      </w:r>
+      <w:r>
+        <w:t xml:space="preserve">Use the product’s own images</w:t>
+      </w:r>
+      <w:r>
+        <w:t xml:space="preserve">”</w:t>
+      </w:r>
+      <w:r>
+        <w:t xml:space="preserve"> </w:t>
+      </w:r>
+      <w:r>
+        <w:t xml:space="preserve">switched on.</w:t>
+      </w:r>
+    </w:p>
     <w:bookmarkEnd w:id="24"/>
-    <w:bookmarkStart w:id="25" w:name="new-buy-section-options"/>
+    <w:bookmarkStart w:id="25" w:name="product-images-come-from-shopify-admin"/>
     <w:p>
       <w:pPr>
         <w:pStyle w:val="Heading1"/>
       </w:pPr>
       <w:r>
-        <w:t xml:space="preserve">New buy section options</w:t>
+        <w:t xml:space="preserve">Product images come from Shopify admin</w:t>
       </w:r>
     </w:p>
     <w:p>
@@ -952,7 +1037,7 @@
         <w:pStyle w:val="FirstParagraph"/>
       </w:pPr>
       <w:r>
-        <w:t xml:space="preserve">All are in</w:t>
+        <w:t xml:space="preserve">New setting in</w:t>
       </w:r>
       <w:r>
         <w:t xml:space="preserve"> </w:t>
@@ -964,7 +1049,32 @@
         <w:t xml:space="preserve">sections/muto-crea-buy.liquid</w:t>
       </w:r>
       <w:r>
-        <w:t xml:space="preserve">. They only appear when filled in, and today only the creatine-kit template uses them.</w:t>
+        <w:t xml:space="preserve">:</w:t>
+      </w:r>
+      <w:r>
+        <w:t xml:space="preserve"> </w:t>
+      </w:r>
+      <w:r>
+        <w:rPr>
+          <w:bCs/>
+          <w:b/>
+        </w:rPr>
+        <w:t xml:space="preserve">Use the product’s own images</w:t>
+      </w:r>
+      <w:r>
+        <w:t xml:space="preserve"> </w:t>
+      </w:r>
+      <w:r>
+        <w:t xml:space="preserve">(</w:t>
+      </w:r>
+      <w:r>
+        <w:rPr>
+          <w:rStyle w:val="VerbatimChar"/>
+        </w:rPr>
+        <w:t xml:space="preserve">gallery_from_product</w:t>
+      </w:r>
+      <w:r>
+        <w:t xml:space="preserve">, off by default).</w:t>
       </w:r>
     </w:p>
     <w:p>
@@ -976,17 +1086,7 @@
         <w:pStyle w:val="Compact"/>
       </w:pPr>
       <w:r>
-        <w:rPr>
-          <w:bCs/>
-          <w:b/>
-        </w:rPr>
-        <w:t xml:space="preserve">Wider kit grid:</w:t>
-      </w:r>
-      <w:r>
-        <w:t xml:space="preserve"> </w:t>
-      </w:r>
-      <w:r>
-        <w:t xml:space="preserve">with more than 4 gifts, the kit images sit on one row (one column per gift) instead of wrapping.</w:t>
+        <w:t xml:space="preserve">When it’s on, the gallery and thumbnails show the product’s images from Products → Media in Shopify admin, in that order, with each image’s alt text (product title if blank). Change, add or reorder images there and the product page updates; no theme edit needed.</w:t>
       </w:r>
     </w:p>
     <w:p>
@@ -998,50 +1098,7 @@
         <w:pStyle w:val="Compact"/>
       </w:pPr>
       <w:r>
-        <w:rPr>
-          <w:bCs/>
-          <w:b/>
-        </w:rPr>
-        <w:t xml:space="preserve">Itemised list</w:t>
-      </w:r>
-      <w:r>
-        <w:t xml:space="preserve"> </w:t>
-      </w:r>
-      <w:r>
-        <w:t xml:space="preserve">(</w:t>
-      </w:r>
-      <w:r>
-        <w:rPr>
-          <w:rStyle w:val="VerbatimChar"/>
-        </w:rPr>
-        <w:t xml:space="preserve">kit_itemised</w:t>
-      </w:r>
-      <w:r>
-        <w:t xml:space="preserve">,</w:t>
-      </w:r>
-      <w:r>
-        <w:t xml:space="preserve"> </w:t>
-      </w:r>
-      <w:r>
-        <w:rPr>
-          <w:rStyle w:val="VerbatimChar"/>
-        </w:rPr>
-        <w:t xml:space="preserve">kit_main</w:t>
-      </w:r>
-      <w:r>
-        <w:t xml:space="preserve">,</w:t>
-      </w:r>
-      <w:r>
-        <w:t xml:space="preserve"> </w:t>
-      </w:r>
-      <w:r>
-        <w:rPr>
-          <w:rStyle w:val="VerbatimChar"/>
-        </w:rPr>
-        <w:t xml:space="preserve">kit_main_note</w:t>
-      </w:r>
-      <w:r>
-        <w:t xml:space="preserve">): an</w:t>
+        <w:t xml:space="preserve">When it’s off, or the product has no images, the gallery uses the</w:t>
       </w:r>
       <w:r>
         <w:t xml:space="preserve"> </w:t>
@@ -1050,7 +1107,7 @@
         <w:t xml:space="preserve">“</w:t>
       </w:r>
       <w:r>
-        <w:t xml:space="preserve">includes</w:t>
+        <w:t xml:space="preserve">Gallery image</w:t>
       </w:r>
       <w:r>
         <w:t xml:space="preserve">”</w:t>
@@ -1059,79 +1116,7 @@
         <w:t xml:space="preserve"> </w:t>
       </w:r>
       <w:r>
-        <w:t xml:space="preserve">list above the kit images. It shows the main product, then one row per gift with its value struck through and</w:t>
-      </w:r>
-      <w:r>
-        <w:t xml:space="preserve"> </w:t>
-      </w:r>
-      <w:r>
-        <w:t xml:space="preserve">“</w:t>
-      </w:r>
-      <w:r>
-        <w:t xml:space="preserve">Free</w:t>
-      </w:r>
-      <w:r>
-        <w:t xml:space="preserve">”</w:t>
-      </w:r>
-      <w:r>
-        <w:t xml:space="preserve">. Each gift block gets</w:t>
-      </w:r>
-      <w:r>
-        <w:t xml:space="preserve"> </w:t>
-      </w:r>
-      <w:r>
-        <w:rPr>
-          <w:rStyle w:val="VerbatimChar"/>
-        </w:rPr>
-        <w:t xml:space="preserve">row_label</w:t>
-      </w:r>
-      <w:r>
-        <w:t xml:space="preserve"> </w:t>
-      </w:r>
-      <w:r>
-        <w:t xml:space="preserve">(row name) and</w:t>
-      </w:r>
-      <w:r>
-        <w:t xml:space="preserve"> </w:t>
-      </w:r>
-      <w:r>
-        <w:rPr>
-          <w:rStyle w:val="VerbatimChar"/>
-        </w:rPr>
-        <w:t xml:space="preserve">row_note</w:t>
-      </w:r>
-      <w:r>
-        <w:t xml:space="preserve"> </w:t>
-      </w:r>
-      <w:r>
-        <w:t xml:space="preserve">(replaces</w:t>
-      </w:r>
-      <w:r>
-        <w:t xml:space="preserve"> </w:t>
-      </w:r>
-      <w:r>
-        <w:t xml:space="preserve">“</w:t>
-      </w:r>
-      <w:r>
-        <w:t xml:space="preserve">Free</w:t>
-      </w:r>
-      <w:r>
-        <w:t xml:space="preserve">”</w:t>
-      </w:r>
-      <w:r>
-        <w:t xml:space="preserve">, e.g. </w:t>
-      </w:r>
-      <w:r>
-        <w:t xml:space="preserve">“</w:t>
-      </w:r>
-      <w:r>
-        <w:t xml:space="preserve">Free entry</w:t>
-      </w:r>
-      <w:r>
-        <w:t xml:space="preserve">”</w:t>
-      </w:r>
-      <w:r>
-        <w:t xml:space="preserve">).</w:t>
+        <w:t xml:space="preserve">blocks as before.</w:t>
       </w:r>
     </w:p>
     <w:p>
@@ -1143,98 +1128,154 @@
         <w:pStyle w:val="Compact"/>
       </w:pPr>
       <w:r>
-        <w:rPr>
-          <w:bCs/>
-          <w:b/>
-        </w:rPr>
-        <w:t xml:space="preserve">Footer points under the list</w:t>
-      </w:r>
-      <w:r>
-        <w:t xml:space="preserve"> </w:t>
-      </w:r>
-      <w:r>
-        <w:t xml:space="preserve">(</w:t>
+        <w:t xml:space="preserve">It’s on in every product template in this folder (NAD+, simple NAD+, creatine-kit NAD+, bottle, socks).</w:t>
+      </w:r>
+    </w:p>
+    <w:p>
+      <w:pPr>
+        <w:numPr>
+          <w:ilvl w:val="0"/>
+          <w:numId w:val="1002"/>
+        </w:numPr>
+        <w:pStyle w:val="Compact"/>
+      </w:pPr>
+      <w:r>
+        <w:rPr>
+          <w:bCs/>
+          <w:b/>
+        </w:rPr>
+        <w:t xml:space="preserve">NAD+ pages will change</w:t>
+      </w:r>
+      <w:r>
+        <w:t xml:space="preserve"> </w:t>
+      </w:r>
+      <w:r>
+        <w:t xml:space="preserve">when this ships: they’ll show the 3 images now in the product’s Media (the kit banner,</w:t>
+      </w:r>
+      <w:r>
+        <w:t xml:space="preserve"> </w:t>
+      </w:r>
+      <w:r>
+        <w:t xml:space="preserve">“</w:t>
+      </w:r>
+      <w:r>
+        <w:t xml:space="preserve">19 ingredients. Nothing hidden.</w:t>
+      </w:r>
+      <w:r>
+        <w:t xml:space="preserve">”</w:t>
+      </w:r>
+      <w:r>
+        <w:t xml:space="preserve"> </w:t>
+      </w:r>
+      <w:r>
+        <w:t xml:space="preserve">and the label/jar shot) instead of the old gallery (kit set + two cyclist photos). Bottle and socks look the same, because their Media already matches.</w:t>
+      </w:r>
+    </w:p>
+    <w:p>
+      <w:pPr>
+        <w:numPr>
+          <w:ilvl w:val="0"/>
+          <w:numId w:val="1002"/>
+        </w:numPr>
+        <w:pStyle w:val="Compact"/>
+      </w:pPr>
+      <w:r>
+        <w:rPr>
+          <w:bCs/>
+          <w:b/>
+        </w:rPr>
+        <w:t xml:space="preserve">Creatine page:</w:t>
+      </w:r>
+      <w:r>
+        <w:t xml:space="preserve"> </w:t>
+      </w:r>
+      <w:r>
+        <w:t xml:space="preserve">its template isn’t in this folder. Turn the setting on in the theme editor (product page → Buy box →</w:t>
+      </w:r>
+      <w:r>
+        <w:t xml:space="preserve"> </w:t>
+      </w:r>
+      <w:r>
+        <w:t xml:space="preserve">“</w:t>
+      </w:r>
+      <w:r>
+        <w:t xml:space="preserve">Use the product’s own images</w:t>
+      </w:r>
+      <w:r>
+        <w:t xml:space="preserve">”</w:t>
+      </w:r>
+      <w:r>
+        <w:t xml:space="preserve">) after copying the section. Its Media already matches its gallery.</w:t>
+      </w:r>
+    </w:p>
+    <w:p>
+      <w:pPr>
+        <w:numPr>
+          <w:ilvl w:val="0"/>
+          <w:numId w:val="1002"/>
+        </w:numPr>
+        <w:pStyle w:val="Compact"/>
+      </w:pPr>
+      <w:r>
+        <w:t xml:space="preserve">Images should be 4:3 (1290×968 today) to fit the gallery frame without cropping.</w:t>
+      </w:r>
+    </w:p>
+    <w:bookmarkEnd w:id="25"/>
+    <w:bookmarkStart w:id="26" w:name="kit-options"/>
+    <w:p>
+      <w:pPr>
+        <w:pStyle w:val="Heading1"/>
+      </w:pPr>
+      <w:r>
+        <w:t xml:space="preserve">Kit options</w:t>
+      </w:r>
+    </w:p>
+    <w:p>
+      <w:pPr>
+        <w:pStyle w:val="FirstParagraph"/>
+      </w:pPr>
+      <w:r>
+        <w:t xml:space="preserve">These are also in</w:t>
+      </w:r>
+      <w:r>
+        <w:t xml:space="preserve"> </w:t>
       </w:r>
       <w:r>
         <w:rPr>
           <w:rStyle w:val="VerbatimChar"/>
         </w:rPr>
-        <w:t xml:space="preserve">kit_foot_1</w:t>
-      </w:r>
-      <w:r>
-        <w:t xml:space="preserve"> </w:t>
-      </w:r>
-      <w:r>
-        <w:t xml:space="preserve">to</w:t>
-      </w:r>
-      <w:r>
-        <w:t xml:space="preserve"> </w:t>
-      </w:r>
-      <w:r>
-        <w:rPr>
-          <w:rStyle w:val="VerbatimChar"/>
-        </w:rPr>
-        <w:t xml:space="preserve">kit_foot_4</w:t>
-      </w:r>
-      <w:r>
-        <w:t xml:space="preserve">), each with an icon (tick, clock, chevron, cross).</w:t>
+        <w:t xml:space="preserve">sections/muto-crea-buy.liquid</w:t>
+      </w:r>
+      <w:r>
+        <w:t xml:space="preserve">. They only appear when filled in, and today only the creatine-kit template uses them.</w:t>
       </w:r>
     </w:p>
     <w:p>
       <w:pPr>
         <w:numPr>
-          <w:ilvl w:val="1"/>
+          <w:ilvl w:val="0"/>
           <w:numId w:val="1003"/>
         </w:numPr>
         <w:pStyle w:val="Compact"/>
       </w:pPr>
       <w:r>
-        <w:t xml:space="preserve">Points 1, 3 and 4 can open a pop-up: set</w:t>
-      </w:r>
-      <w:r>
-        <w:t xml:space="preserve"> </w:t>
-      </w:r>
-      <w:r>
-        <w:rPr>
-          <w:rStyle w:val="VerbatimChar"/>
-        </w:rPr>
-        <w:t xml:space="preserve">kit_foot_N_pop_title</w:t>
-      </w:r>
-      <w:r>
-        <w:t xml:space="preserve"> </w:t>
-      </w:r>
-      <w:r>
-        <w:t xml:space="preserve">and</w:t>
-      </w:r>
-      <w:r>
-        <w:t xml:space="preserve"> </w:t>
-      </w:r>
-      <w:r>
-        <w:rPr>
-          <w:rStyle w:val="VerbatimChar"/>
-        </w:rPr>
-        <w:t xml:space="preserve">kit_foot_N_pop</w:t>
-      </w:r>
-      <w:r>
-        <w:t xml:space="preserve">. The point then becomes an underlined link that opens a native</w:t>
-      </w:r>
-      <w:r>
-        <w:t xml:space="preserve"> </w:t>
-      </w:r>
-      <w:r>
-        <w:rPr>
-          <w:rStyle w:val="VerbatimChar"/>
-        </w:rPr>
-        <w:t xml:space="preserve">&lt;dialog&gt;</w:t>
-      </w:r>
-      <w:r>
-        <w:t xml:space="preserve">. It closes with the × button, the Esc key or a click on the backdrop.</w:t>
+        <w:rPr>
+          <w:bCs/>
+          <w:b/>
+        </w:rPr>
+        <w:t xml:space="preserve">Wider kit grid:</w:t>
+      </w:r>
+      <w:r>
+        <w:t xml:space="preserve"> </w:t>
+      </w:r>
+      <w:r>
+        <w:t xml:space="preserve">with more than 4 gifts, the kit images sit on one row (one column per gift) instead of wrapping.</w:t>
       </w:r>
     </w:p>
     <w:p>
       <w:pPr>
         <w:numPr>
-          <w:ilvl w:val="1"/>
+          <w:ilvl w:val="0"/>
           <w:numId w:val="1003"/>
         </w:numPr>
         <w:pStyle w:val="Compact"/>
@@ -1244,6 +1285,248 @@
           <w:bCs/>
           <w:b/>
         </w:rPr>
+        <w:t xml:space="preserve">Itemised list</w:t>
+      </w:r>
+      <w:r>
+        <w:t xml:space="preserve"> </w:t>
+      </w:r>
+      <w:r>
+        <w:t xml:space="preserve">(</w:t>
+      </w:r>
+      <w:r>
+        <w:rPr>
+          <w:rStyle w:val="VerbatimChar"/>
+        </w:rPr>
+        <w:t xml:space="preserve">kit_itemised</w:t>
+      </w:r>
+      <w:r>
+        <w:t xml:space="preserve">,</w:t>
+      </w:r>
+      <w:r>
+        <w:t xml:space="preserve"> </w:t>
+      </w:r>
+      <w:r>
+        <w:rPr>
+          <w:rStyle w:val="VerbatimChar"/>
+        </w:rPr>
+        <w:t xml:space="preserve">kit_main</w:t>
+      </w:r>
+      <w:r>
+        <w:t xml:space="preserve">,</w:t>
+      </w:r>
+      <w:r>
+        <w:t xml:space="preserve"> </w:t>
+      </w:r>
+      <w:r>
+        <w:rPr>
+          <w:rStyle w:val="VerbatimChar"/>
+        </w:rPr>
+        <w:t xml:space="preserve">kit_main_note</w:t>
+      </w:r>
+      <w:r>
+        <w:t xml:space="preserve">): an</w:t>
+      </w:r>
+      <w:r>
+        <w:t xml:space="preserve"> </w:t>
+      </w:r>
+      <w:r>
+        <w:t xml:space="preserve">“</w:t>
+      </w:r>
+      <w:r>
+        <w:t xml:space="preserve">includes</w:t>
+      </w:r>
+      <w:r>
+        <w:t xml:space="preserve">”</w:t>
+      </w:r>
+      <w:r>
+        <w:t xml:space="preserve"> </w:t>
+      </w:r>
+      <w:r>
+        <w:t xml:space="preserve">list above the kit images. It shows the main product, then one row per gift with its value struck through and</w:t>
+      </w:r>
+      <w:r>
+        <w:t xml:space="preserve"> </w:t>
+      </w:r>
+      <w:r>
+        <w:t xml:space="preserve">“</w:t>
+      </w:r>
+      <w:r>
+        <w:t xml:space="preserve">Free</w:t>
+      </w:r>
+      <w:r>
+        <w:t xml:space="preserve">”</w:t>
+      </w:r>
+      <w:r>
+        <w:t xml:space="preserve">. Each gift block gets</w:t>
+      </w:r>
+      <w:r>
+        <w:t xml:space="preserve"> </w:t>
+      </w:r>
+      <w:r>
+        <w:rPr>
+          <w:rStyle w:val="VerbatimChar"/>
+        </w:rPr>
+        <w:t xml:space="preserve">row_label</w:t>
+      </w:r>
+      <w:r>
+        <w:t xml:space="preserve"> </w:t>
+      </w:r>
+      <w:r>
+        <w:t xml:space="preserve">(row name) and</w:t>
+      </w:r>
+      <w:r>
+        <w:t xml:space="preserve"> </w:t>
+      </w:r>
+      <w:r>
+        <w:rPr>
+          <w:rStyle w:val="VerbatimChar"/>
+        </w:rPr>
+        <w:t xml:space="preserve">row_note</w:t>
+      </w:r>
+      <w:r>
+        <w:t xml:space="preserve"> </w:t>
+      </w:r>
+      <w:r>
+        <w:t xml:space="preserve">(replaces</w:t>
+      </w:r>
+      <w:r>
+        <w:t xml:space="preserve"> </w:t>
+      </w:r>
+      <w:r>
+        <w:t xml:space="preserve">“</w:t>
+      </w:r>
+      <w:r>
+        <w:t xml:space="preserve">Free</w:t>
+      </w:r>
+      <w:r>
+        <w:t xml:space="preserve">”</w:t>
+      </w:r>
+      <w:r>
+        <w:t xml:space="preserve">, e.g. </w:t>
+      </w:r>
+      <w:r>
+        <w:t xml:space="preserve">“</w:t>
+      </w:r>
+      <w:r>
+        <w:t xml:space="preserve">Free entry</w:t>
+      </w:r>
+      <w:r>
+        <w:t xml:space="preserve">”</w:t>
+      </w:r>
+      <w:r>
+        <w:t xml:space="preserve">).</w:t>
+      </w:r>
+    </w:p>
+    <w:p>
+      <w:pPr>
+        <w:numPr>
+          <w:ilvl w:val="0"/>
+          <w:numId w:val="1003"/>
+        </w:numPr>
+        <w:pStyle w:val="Compact"/>
+      </w:pPr>
+      <w:r>
+        <w:rPr>
+          <w:bCs/>
+          <w:b/>
+        </w:rPr>
+        <w:t xml:space="preserve">Footer points under the list</w:t>
+      </w:r>
+      <w:r>
+        <w:t xml:space="preserve"> </w:t>
+      </w:r>
+      <w:r>
+        <w:t xml:space="preserve">(</w:t>
+      </w:r>
+      <w:r>
+        <w:rPr>
+          <w:rStyle w:val="VerbatimChar"/>
+        </w:rPr>
+        <w:t xml:space="preserve">kit_foot_1</w:t>
+      </w:r>
+      <w:r>
+        <w:t xml:space="preserve"> </w:t>
+      </w:r>
+      <w:r>
+        <w:t xml:space="preserve">to</w:t>
+      </w:r>
+      <w:r>
+        <w:t xml:space="preserve"> </w:t>
+      </w:r>
+      <w:r>
+        <w:rPr>
+          <w:rStyle w:val="VerbatimChar"/>
+        </w:rPr>
+        <w:t xml:space="preserve">kit_foot_4</w:t>
+      </w:r>
+      <w:r>
+        <w:t xml:space="preserve">), each with an icon (tick, clock, chevron, cross).</w:t>
+      </w:r>
+    </w:p>
+    <w:p>
+      <w:pPr>
+        <w:numPr>
+          <w:ilvl w:val="1"/>
+          <w:numId w:val="1004"/>
+        </w:numPr>
+        <w:pStyle w:val="Compact"/>
+      </w:pPr>
+      <w:r>
+        <w:t xml:space="preserve">Points 1, 3 and 4 can open a pop-up: set</w:t>
+      </w:r>
+      <w:r>
+        <w:t xml:space="preserve"> </w:t>
+      </w:r>
+      <w:r>
+        <w:rPr>
+          <w:rStyle w:val="VerbatimChar"/>
+        </w:rPr>
+        <w:t xml:space="preserve">kit_foot_N_pop_title</w:t>
+      </w:r>
+      <w:r>
+        <w:t xml:space="preserve"> </w:t>
+      </w:r>
+      <w:r>
+        <w:t xml:space="preserve">and</w:t>
+      </w:r>
+      <w:r>
+        <w:t xml:space="preserve"> </w:t>
+      </w:r>
+      <w:r>
+        <w:rPr>
+          <w:rStyle w:val="VerbatimChar"/>
+        </w:rPr>
+        <w:t xml:space="preserve">kit_foot_N_pop</w:t>
+      </w:r>
+      <w:r>
+        <w:t xml:space="preserve">. The point then becomes an underlined link that opens a native</w:t>
+      </w:r>
+      <w:r>
+        <w:t xml:space="preserve"> </w:t>
+      </w:r>
+      <w:r>
+        <w:rPr>
+          <w:rStyle w:val="VerbatimChar"/>
+        </w:rPr>
+        <w:t xml:space="preserve">&lt;dialog&gt;</w:t>
+      </w:r>
+      <w:r>
+        <w:t xml:space="preserve">. It closes with the × button, the Esc key or a click on the backdrop.</w:t>
+      </w:r>
+    </w:p>
+    <w:p>
+      <w:pPr>
+        <w:numPr>
+          <w:ilvl w:val="1"/>
+          <w:numId w:val="1004"/>
+        </w:numPr>
+        <w:pStyle w:val="Compact"/>
+      </w:pPr>
+      <w:r>
+        <w:rPr>
+          <w:bCs/>
+          <w:b/>
+        </w:rPr>
         <w:t xml:space="preserve">Point 4 shows on phones only</w:t>
       </w:r>
       <w:r>
@@ -1253,8 +1536,8 @@
         <w:t xml:space="preserve">(under 750px). There, the four points form a 2×2 grid. On desktop the first three stay on one line.</w:t>
       </w:r>
     </w:p>
-    <w:bookmarkEnd w:id="25"/>
-    <w:bookmarkStart w:id="26" w:name="new-nad-page-with-creatine-in-the-kit"/>
+    <w:bookmarkEnd w:id="26"/>
+    <w:bookmarkStart w:id="27" w:name="new-nad-page-with-creatine-in-the-kit"/>
     <w:p>
       <w:pPr>
         <w:pStyle w:val="Heading1"/>
@@ -1864,8 +2147,8 @@
         <w:t xml:space="preserve">). They aren’t in this folder: the first carries the unreleased 3M refill plan, and the simple one can be rebuilt on live if it’s wanted.</w:t>
       </w:r>
     </w:p>
-    <w:bookmarkEnd w:id="26"/>
-    <w:bookmarkStart w:id="27" w:name="still-open"/>
+    <w:bookmarkEnd w:id="27"/>
+    <w:bookmarkStart w:id="28" w:name="still-open"/>
     <w:p>
       <w:pPr>
         <w:pStyle w:val="Heading1"/>
@@ -1880,764 +2163,6 @@
       </w:pPr>
       <w:r>
         <w:t xml:space="preserve">Most of these are copy decisions for Richie, not dev work.</w:t>
-      </w:r>
-    </w:p>
-    <w:p>
-      <w:pPr>
-        <w:numPr>
-          <w:ilvl w:val="0"/>
-          <w:numId w:val="1004"/>
-        </w:numPr>
-        <w:pStyle w:val="Compact"/>
-      </w:pPr>
-      <w:r>
-        <w:t xml:space="preserve">☐</w:t>
-      </w:r>
-      <w:r>
-        <w:t xml:space="preserve"> </w:t>
-      </w:r>
-      <w:r>
-        <w:rPr>
-          <w:bCs/>
-          <w:b/>
-        </w:rPr>
-        <w:t xml:space="preserve">“</w:t>
-      </w:r>
-      <w:r>
-        <w:rPr>
-          <w:bCs/>
-          <w:b/>
-        </w:rPr>
-        <w:t xml:space="preserve">Fewer than 0.1% ask for their money back</w:t>
-      </w:r>
-      <w:r>
-        <w:rPr>
-          <w:bCs/>
-          <w:b/>
-        </w:rPr>
-        <w:t xml:space="preserve">”</w:t>
-      </w:r>
-      <w:r>
-        <w:t xml:space="preserve"> </w:t>
-      </w:r>
-      <w:r>
-        <w:t xml:space="preserve">(guarantee pop-up): confirm it’s backed by refund data before going live.</w:t>
-      </w:r>
-    </w:p>
-    <w:p>
-      <w:pPr>
-        <w:numPr>
-          <w:ilvl w:val="0"/>
-          <w:numId w:val="1004"/>
-        </w:numPr>
-        <w:pStyle w:val="Compact"/>
-      </w:pPr>
-      <w:r>
-        <w:t xml:space="preserve">☐</w:t>
-      </w:r>
-      <w:r>
-        <w:t xml:space="preserve"> </w:t>
-      </w:r>
-      <w:r>
-        <w:rPr>
-          <w:bCs/>
-          <w:b/>
-        </w:rPr>
-        <w:t xml:space="preserve">“</w:t>
-      </w:r>
-      <w:r>
-        <w:rPr>
-          <w:bCs/>
-          <w:b/>
-        </w:rPr>
-        <w:t xml:space="preserve">No commitment</w:t>
-      </w:r>
-      <w:r>
-        <w:rPr>
-          <w:bCs/>
-          <w:b/>
-        </w:rPr>
-        <w:t xml:space="preserve">”</w:t>
-      </w:r>
-      <w:r>
-        <w:rPr>
-          <w:bCs/>
-          <w:b/>
-        </w:rPr>
-        <w:t xml:space="preserve"> </w:t>
-      </w:r>
-      <w:r>
-        <w:rPr>
-          <w:bCs/>
-          <w:b/>
-        </w:rPr>
-        <w:t xml:space="preserve">and</w:t>
-      </w:r>
-      <w:r>
-        <w:rPr>
-          <w:bCs/>
-          <w:b/>
-        </w:rPr>
-        <w:t xml:space="preserve"> </w:t>
-      </w:r>
-      <w:r>
-        <w:rPr>
-          <w:bCs/>
-          <w:b/>
-        </w:rPr>
-        <w:t xml:space="preserve">“</w:t>
-      </w:r>
-      <w:r>
-        <w:rPr>
-          <w:bCs/>
-          <w:b/>
-        </w:rPr>
-        <w:t xml:space="preserve">Skip or cancel anytime</w:t>
-      </w:r>
-      <w:r>
-        <w:rPr>
-          <w:bCs/>
-          <w:b/>
-        </w:rPr>
-        <w:t xml:space="preserve">”</w:t>
-      </w:r>
-      <w:r>
-        <w:t xml:space="preserve"> </w:t>
-      </w:r>
-      <w:r>
-        <w:t xml:space="preserve">say much the same thing on phones. Keep both, or drop one.</w:t>
-      </w:r>
-    </w:p>
-    <w:p>
-      <w:pPr>
-        <w:numPr>
-          <w:ilvl w:val="0"/>
-          <w:numId w:val="1004"/>
-        </w:numPr>
-        <w:pStyle w:val="Compact"/>
-      </w:pPr>
-      <w:r>
-        <w:t xml:space="preserve">☐</w:t>
-      </w:r>
-      <w:r>
-        <w:t xml:space="preserve"> </w:t>
-      </w:r>
-      <w:r>
-        <w:rPr>
-          <w:bCs/>
-          <w:b/>
-        </w:rPr>
-        <w:t xml:space="preserve">“</w:t>
-      </w:r>
-      <w:r>
-        <w:rPr>
-          <w:bCs/>
-          <w:b/>
-        </w:rPr>
-        <w:t xml:space="preserve">Free gifts worth £249</w:t>
-      </w:r>
-      <w:r>
-        <w:rPr>
-          <w:bCs/>
-          <w:b/>
-        </w:rPr>
-        <w:t xml:space="preserve">”</w:t>
-      </w:r>
-      <w:r>
-        <w:t xml:space="preserve"> </w:t>
-      </w:r>
-      <w:r>
-        <w:t xml:space="preserve">(plans banner, same as live) was set before creatine (£30) joined the first-order kit. Check the figure on the creatine-kit page.</w:t>
-      </w:r>
-    </w:p>
-    <w:p>
-      <w:pPr>
-        <w:numPr>
-          <w:ilvl w:val="0"/>
-          <w:numId w:val="1004"/>
-        </w:numPr>
-        <w:pStyle w:val="Compact"/>
-      </w:pPr>
-      <w:r>
-        <w:t xml:space="preserve">☐</w:t>
-      </w:r>
-      <w:r>
-        <w:t xml:space="preserve"> </w:t>
-      </w:r>
-      <w:r>
-        <w:rPr>
-          <w:bCs/>
-          <w:b/>
-        </w:rPr>
-        <w:t xml:space="preserve">Creatine at later orders:</w:t>
-      </w:r>
-      <w:r>
-        <w:t xml:space="preserve"> </w:t>
-      </w:r>
-      <w:r>
-        <w:t xml:space="preserve">creatine is still the gift at orders 4 and 6 (as on live) and now also in the first-order kit. Confirm that’s intended.</w:t>
-      </w:r>
-    </w:p>
-    <w:p>
-      <w:pPr>
-        <w:numPr>
-          <w:ilvl w:val="0"/>
-          <w:numId w:val="1004"/>
-        </w:numPr>
-        <w:pStyle w:val="Compact"/>
-      </w:pPr>
-      <w:r>
-        <w:t xml:space="preserve">☐</w:t>
-      </w:r>
-      <w:r>
-        <w:t xml:space="preserve"> </w:t>
-      </w:r>
-      <w:r>
-        <w:rPr>
-          <w:bCs/>
-          <w:b/>
-        </w:rPr>
-        <w:t xml:space="preserve">Refund policy</w:t>
-      </w:r>
-      <w:r>
-        <w:t xml:space="preserve"> </w:t>
-      </w:r>
-      <w:r>
-        <w:t xml:space="preserve">(Settings → Policies) still describes a 30-day guarantee with a wearable export. Rewrite it to the FAQ terms: 90 days, first-time subscribers at muto.co, less delivery costs, claim within 14 days after the 90 days end, wearable data optional.</w:t>
-      </w:r>
-    </w:p>
-    <w:p>
-      <w:pPr>
-        <w:numPr>
-          <w:ilvl w:val="0"/>
-          <w:numId w:val="1004"/>
-        </w:numPr>
-        <w:pStyle w:val="Compact"/>
-      </w:pPr>
-      <w:r>
-        <w:t xml:space="preserve">☐</w:t>
-      </w:r>
-      <w:r>
-        <w:t xml:space="preserve"> </w:t>
-      </w:r>
-      <w:r>
-        <w:rPr>
-          <w:bCs/>
-          <w:b/>
-        </w:rPr>
-        <w:t xml:space="preserve">“</w:t>
-      </w:r>
-      <w:r>
-        <w:rPr>
-          <w:bCs/>
-          <w:b/>
-        </w:rPr>
-        <w:t xml:space="preserve">Full refund</w:t>
-      </w:r>
-      <w:r>
-        <w:rPr>
-          <w:bCs/>
-          <w:b/>
-        </w:rPr>
-        <w:t xml:space="preserve">”</w:t>
-      </w:r>
-      <w:r>
-        <w:rPr>
-          <w:bCs/>
-          <w:b/>
-        </w:rPr>
-        <w:t xml:space="preserve"> </w:t>
-      </w:r>
-      <w:r>
-        <w:rPr>
-          <w:bCs/>
-          <w:b/>
-        </w:rPr>
-        <w:t xml:space="preserve">wording</w:t>
-      </w:r>
-      <w:r>
-        <w:t xml:space="preserve"> </w:t>
-      </w:r>
-      <w:r>
-        <w:t xml:space="preserve">on the NAD+ product page: the</w:t>
-      </w:r>
-      <w:r>
-        <w:t xml:space="preserve"> </w:t>
-      </w:r>
-      <w:r>
-        <w:t xml:space="preserve">“</w:t>
-      </w:r>
-      <w:r>
-        <w:t xml:space="preserve">90-Day Money back Guarantee</w:t>
-      </w:r>
-      <w:r>
-        <w:t xml:space="preserve">”</w:t>
-      </w:r>
-      <w:r>
-        <w:t xml:space="preserve"> </w:t>
-      </w:r>
-      <w:r>
-        <w:t xml:space="preserve">accordion and the guarantee section say</w:t>
-      </w:r>
-      <w:r>
-        <w:t xml:space="preserve"> </w:t>
-      </w:r>
-      <w:r>
-        <w:t xml:space="preserve">“</w:t>
-      </w:r>
-      <w:r>
-        <w:t xml:space="preserve">in full</w:t>
-      </w:r>
-      <w:r>
-        <w:t xml:space="preserve">”</w:t>
-      </w:r>
-      <w:r>
-        <w:t xml:space="preserve">. The FAQ says</w:t>
-      </w:r>
-      <w:r>
-        <w:t xml:space="preserve"> </w:t>
-      </w:r>
-      <w:r>
-        <w:t xml:space="preserve">“</w:t>
-      </w:r>
-      <w:r>
-        <w:t xml:space="preserve">less our delivery costs</w:t>
-      </w:r>
-      <w:r>
-        <w:t xml:space="preserve">”</w:t>
-      </w:r>
-      <w:r>
-        <w:t xml:space="preserve">.</w:t>
-      </w:r>
-    </w:p>
-    <w:p>
-      <w:pPr>
-        <w:numPr>
-          <w:ilvl w:val="0"/>
-          <w:numId w:val="1004"/>
-        </w:numPr>
-        <w:pStyle w:val="Compact"/>
-      </w:pPr>
-      <w:r>
-        <w:t xml:space="preserve">☐</w:t>
-      </w:r>
-      <w:r>
-        <w:t xml:space="preserve"> </w:t>
-      </w:r>
-      <w:r>
-        <w:rPr>
-          <w:bCs/>
-          <w:b/>
-        </w:rPr>
-        <w:t xml:space="preserve">“</w:t>
-      </w:r>
-      <w:r>
-        <w:rPr>
-          <w:bCs/>
-          <w:b/>
-        </w:rPr>
-        <w:t xml:space="preserve">Pre-Order Now - Arrives 15/10</w:t>
-      </w:r>
-      <w:r>
-        <w:rPr>
-          <w:bCs/>
-          <w:b/>
-        </w:rPr>
-        <w:t xml:space="preserve">”</w:t>
-      </w:r>
-      <w:r>
-        <w:t xml:space="preserve"> </w:t>
-      </w:r>
-      <w:r>
-        <w:t xml:space="preserve">is hard-coded in the Add to Cart button in</w:t>
-      </w:r>
-      <w:r>
-        <w:t xml:space="preserve"> </w:t>
-      </w:r>
-      <w:r>
-        <w:rPr>
-          <w:rStyle w:val="VerbatimChar"/>
-        </w:rPr>
-        <w:t xml:space="preserve">muto-crea-buy.liquid</w:t>
-      </w:r>
-      <w:r>
-        <w:t xml:space="preserve">, not a setting. Remove it after 15 Oct.</w:t>
-      </w:r>
-    </w:p>
-    <w:p>
-      <w:pPr>
-        <w:numPr>
-          <w:ilvl w:val="0"/>
-          <w:numId w:val="1004"/>
-        </w:numPr>
-        <w:pStyle w:val="Compact"/>
-      </w:pPr>
-      <w:r>
-        <w:t xml:space="preserve">☐</w:t>
-      </w:r>
-      <w:r>
-        <w:t xml:space="preserve"> </w:t>
-      </w:r>
-      <w:r>
-        <w:rPr>
-          <w:bCs/>
-          <w:b/>
-        </w:rPr>
-        <w:t xml:space="preserve">Product search description</w:t>
-      </w:r>
-      <w:r>
-        <w:t xml:space="preserve"> </w:t>
-      </w:r>
-      <w:r>
-        <w:t xml:space="preserve">(SEO) still says</w:t>
-      </w:r>
-      <w:r>
-        <w:t xml:space="preserve"> </w:t>
-      </w:r>
-      <w:r>
-        <w:t xml:space="preserve">“</w:t>
-      </w:r>
-      <w:r>
-        <w:t xml:space="preserve">stress resilience</w:t>
-      </w:r>
-      <w:r>
-        <w:t xml:space="preserve">”</w:t>
-      </w:r>
-      <w:r>
-        <w:t xml:space="preserve">.</w:t>
-      </w:r>
-    </w:p>
-    <w:p>
-      <w:pPr>
-        <w:numPr>
-          <w:ilvl w:val="0"/>
-          <w:numId w:val="1004"/>
-        </w:numPr>
-        <w:pStyle w:val="Compact"/>
-      </w:pPr>
-      <w:r>
-        <w:t xml:space="preserve">☐</w:t>
-      </w:r>
-      <w:r>
-        <w:t xml:space="preserve"> </w:t>
-      </w:r>
-      <w:r>
-        <w:rPr>
-          <w:bCs/>
-          <w:b/>
-        </w:rPr>
-        <w:t xml:space="preserve">“</w:t>
-      </w:r>
-      <w:r>
-        <w:rPr>
-          <w:bCs/>
-          <w:b/>
-        </w:rPr>
-        <w:t xml:space="preserve">300+ supporting studies</w:t>
-      </w:r>
-      <w:r>
-        <w:rPr>
-          <w:bCs/>
-          <w:b/>
-        </w:rPr>
-        <w:t xml:space="preserve">”</w:t>
-      </w:r>
-      <w:r>
-        <w:t xml:space="preserve"> </w:t>
-      </w:r>
-      <w:r>
-        <w:t xml:space="preserve">stat on the home page: flagged in the FAQ brief as unsupported.</w:t>
-      </w:r>
-    </w:p>
-    <w:p>
-      <w:pPr>
-        <w:numPr>
-          <w:ilvl w:val="0"/>
-          <w:numId w:val="1004"/>
-        </w:numPr>
-        <w:pStyle w:val="Compact"/>
-      </w:pPr>
-      <w:r>
-        <w:t xml:space="preserve">☐</w:t>
-      </w:r>
-      <w:r>
-        <w:t xml:space="preserve"> </w:t>
-      </w:r>
-      <w:r>
-        <w:rPr>
-          <w:bCs/>
-          <w:b/>
-        </w:rPr>
-        <w:t xml:space="preserve">/pages/muto-home</w:t>
-      </w:r>
-      <w:r>
-        <w:t xml:space="preserve"> </w:t>
-      </w:r>
-      <w:r>
-        <w:t xml:space="preserve">still has the old buttons (</w:t>
-      </w:r>
-      <w:r>
-        <w:t xml:space="preserve">“</w:t>
-      </w:r>
-      <w:r>
-        <w:t xml:space="preserve">Start your 90 days</w:t>
-      </w:r>
-      <w:r>
-        <w:t xml:space="preserve">”</w:t>
-      </w:r>
-      <w:r>
-        <w:t xml:space="preserve">,</w:t>
-      </w:r>
-      <w:r>
-        <w:t xml:space="preserve"> </w:t>
-      </w:r>
-      <w:r>
-        <w:t xml:space="preserve">“</w:t>
-      </w:r>
-      <w:r>
-        <w:t xml:space="preserve">Start Today</w:t>
-      </w:r>
-      <w:r>
-        <w:t xml:space="preserve">”</w:t>
-      </w:r>
-      <w:r>
-        <w:t xml:space="preserve">,</w:t>
-      </w:r>
-      <w:r>
-        <w:t xml:space="preserve"> </w:t>
-      </w:r>
-      <w:r>
-        <w:t xml:space="preserve">“</w:t>
-      </w:r>
-      <w:r>
-        <w:t xml:space="preserve">Coming Soon</w:t>
-      </w:r>
-      <w:r>
-        <w:t xml:space="preserve">”</w:t>
-      </w:r>
-      <w:r>
-        <w:t xml:space="preserve">),</w:t>
-      </w:r>
-      <w:r>
-        <w:t xml:space="preserve"> </w:t>
-      </w:r>
-      <w:r>
-        <w:t xml:space="preserve">“</w:t>
-      </w:r>
-      <w:r>
-        <w:t xml:space="preserve">seven scientists</w:t>
-      </w:r>
-      <w:r>
-        <w:t xml:space="preserve">”</w:t>
-      </w:r>
-      <w:r>
-        <w:t xml:space="preserve"> </w:t>
-      </w:r>
-      <w:r>
-        <w:t xml:space="preserve">and the</w:t>
-      </w:r>
-      <w:r>
-        <w:t xml:space="preserve"> </w:t>
-      </w:r>
-      <w:r>
-        <w:t xml:space="preserve">“</w:t>
-      </w:r>
-      <w:r>
-        <w:t xml:space="preserve">7 advisors</w:t>
-      </w:r>
-      <w:r>
-        <w:t xml:space="preserve">”</w:t>
-      </w:r>
-      <w:r>
-        <w:t xml:space="preserve"> </w:t>
-      </w:r>
-      <w:r>
-        <w:t xml:space="preserve">stat.</w:t>
-      </w:r>
-    </w:p>
-    <w:p>
-      <w:pPr>
-        <w:numPr>
-          <w:ilvl w:val="0"/>
-          <w:numId w:val="1004"/>
-        </w:numPr>
-        <w:pStyle w:val="Compact"/>
-      </w:pPr>
-      <w:r>
-        <w:t xml:space="preserve">☐</w:t>
-      </w:r>
-      <w:r>
-        <w:t xml:space="preserve"> </w:t>
-      </w:r>
-      <w:r>
-        <w:rPr>
-          <w:bCs/>
-          <w:b/>
-        </w:rPr>
-        <w:t xml:space="preserve">CoQ10 form on the home page:</w:t>
-      </w:r>
-      <w:r>
-        <w:t xml:space="preserve"> </w:t>
-      </w:r>
-      <w:r>
-        <w:t xml:space="preserve">the science Formula tab and</w:t>
-      </w:r>
-      <w:r>
-        <w:t xml:space="preserve"> </w:t>
-      </w:r>
-      <w:r>
-        <w:t xml:space="preserve">“</w:t>
-      </w:r>
-      <w:r>
-        <w:t xml:space="preserve">What’s inside</w:t>
-      </w:r>
-      <w:r>
-        <w:t xml:space="preserve">”</w:t>
-      </w:r>
-      <w:r>
-        <w:t xml:space="preserve"> </w:t>
-      </w:r>
-      <w:r>
-        <w:t xml:space="preserve">say plain</w:t>
-      </w:r>
-      <w:r>
-        <w:t xml:space="preserve"> </w:t>
-      </w:r>
-      <w:r>
-        <w:t xml:space="preserve">“</w:t>
-      </w:r>
-      <w:r>
-        <w:t xml:space="preserve">CoQ10</w:t>
-      </w:r>
-      <w:r>
-        <w:t xml:space="preserve">”</w:t>
-      </w:r>
-      <w:r>
-        <w:t xml:space="preserve">; the FAQ table says Ubiquinone. Confirm whether the home page should say</w:t>
-      </w:r>
-      <w:r>
-        <w:t xml:space="preserve"> </w:t>
-      </w:r>
-      <w:r>
-        <w:t xml:space="preserve">“</w:t>
-      </w:r>
-      <w:r>
-        <w:t xml:space="preserve">(as ubiquinone)</w:t>
-      </w:r>
-      <w:r>
-        <w:t xml:space="preserve">”</w:t>
-      </w:r>
-      <w:r>
-        <w:t xml:space="preserve">.</w:t>
-      </w:r>
-    </w:p>
-    <w:p>
-      <w:pPr>
-        <w:numPr>
-          <w:ilvl w:val="0"/>
-          <w:numId w:val="1004"/>
-        </w:numPr>
-        <w:pStyle w:val="Compact"/>
-      </w:pPr>
-      <w:r>
-        <w:t xml:space="preserve">☐</w:t>
-      </w:r>
-      <w:r>
-        <w:t xml:space="preserve"> </w:t>
-      </w:r>
-      <w:r>
-        <w:rPr>
-          <w:bCs/>
-          <w:b/>
-        </w:rPr>
-        <w:t xml:space="preserve">Claims review:</w:t>
-      </w:r>
-      <w:r>
-        <w:t xml:space="preserve"> </w:t>
-      </w:r>
-      <w:r>
-        <w:t xml:space="preserve">vitamin K2 sits under the immunity and muscle claims in the science Formula tab, product description and FAQ, but has no authorised claim for either.</w:t>
-      </w:r>
-    </w:p>
-    <w:p>
-      <w:pPr>
-        <w:numPr>
-          <w:ilvl w:val="0"/>
-          <w:numId w:val="1004"/>
-        </w:numPr>
-        <w:pStyle w:val="Compact"/>
-      </w:pPr>
-      <w:r>
-        <w:t xml:space="preserve">☐</w:t>
-      </w:r>
-      <w:r>
-        <w:t xml:space="preserve"> </w:t>
-      </w:r>
-      <w:r>
-        <w:rPr>
-          <w:bCs/>
-          <w:b/>
-        </w:rPr>
-        <w:t xml:space="preserve">Plan per-day prices:</w:t>
-      </w:r>
-      <w:r>
-        <w:t xml:space="preserve"> </w:t>
-      </w:r>
-      <w:r>
-        <w:t xml:space="preserve">live says</w:t>
-      </w:r>
-      <w:r>
-        <w:t xml:space="preserve"> </w:t>
-      </w:r>
-      <w:r>
-        <w:t xml:space="preserve">“</w:t>
-      </w:r>
-      <w:r>
-        <w:t xml:space="preserve">£2/day</w:t>
-      </w:r>
-      <w:r>
-        <w:t xml:space="preserve">”</w:t>
-      </w:r>
-      <w:r>
-        <w:t xml:space="preserve">, but £60 every 4 weeks is about £2.14 a day.</w:t>
-      </w:r>
-    </w:p>
-    <w:p>
-      <w:pPr>
-        <w:numPr>
-          <w:ilvl w:val="0"/>
-          <w:numId w:val="1004"/>
-        </w:numPr>
-        <w:pStyle w:val="Compact"/>
-      </w:pPr>
-      <w:r>
-        <w:t xml:space="preserve">☐</w:t>
-      </w:r>
-      <w:r>
-        <w:t xml:space="preserve"> </w:t>
-      </w:r>
-      <w:r>
-        <w:rPr>
-          <w:bCs/>
-          <w:b/>
-        </w:rPr>
-        <w:t xml:space="preserve">Informed Sport:</w:t>
-      </w:r>
-      <w:r>
-        <w:t xml:space="preserve"> </w:t>
-      </w:r>
-      <w:r>
-        <w:t xml:space="preserve">swap the drug-tested athletes FAQ answer when certification is live (the certified wording is in MUTO_FAQ_Page_Final_Oct26.docx).</w:t>
-      </w:r>
-    </w:p>
-    <w:bookmarkEnd w:id="27"/>
-    <w:bookmarkStart w:id="29" w:name="check-after-publishing"/>
-    <w:p>
-      <w:pPr>
-        <w:pStyle w:val="Heading1"/>
-      </w:pPr>
-      <w:r>
-        <w:t xml:space="preserve">Check after publishing</w:t>
       </w:r>
     </w:p>
     <w:p>
@@ -2649,17 +2174,37 @@
         <w:pStyle w:val="Compact"/>
       </w:pPr>
       <w:r>
-        <w:rPr>
-          <w:bCs/>
-          <w:b/>
-        </w:rPr>
-        <w:t xml:space="preserve">NAD+ product page:</w:t>
-      </w:r>
-      <w:r>
-        <w:t xml:space="preserve"> </w:t>
-      </w:r>
-      <w:r>
-        <w:t xml:space="preserve">looks exactly as it does today. No itemised list, the ticked rows are still there, the review card still rotates, and plan picking still works (the duplicate-option fix is kept).</w:t>
+        <w:t xml:space="preserve">☐</w:t>
+      </w:r>
+      <w:r>
+        <w:t xml:space="preserve"> </w:t>
+      </w:r>
+      <w:r>
+        <w:rPr>
+          <w:bCs/>
+          <w:b/>
+        </w:rPr>
+        <w:t xml:space="preserve">“</w:t>
+      </w:r>
+      <w:r>
+        <w:rPr>
+          <w:bCs/>
+          <w:b/>
+        </w:rPr>
+        <w:t xml:space="preserve">Fewer than 0.1% ask for their money back</w:t>
+      </w:r>
+      <w:r>
+        <w:rPr>
+          <w:bCs/>
+          <w:b/>
+        </w:rPr>
+        <w:t xml:space="preserve">”</w:t>
+      </w:r>
+      <w:r>
+        <w:t xml:space="preserve"> </w:t>
+      </w:r>
+      <w:r>
+        <w:t xml:space="preserve">(guarantee pop-up): confirm it’s backed by refund data before going live.</w:t>
       </w:r>
     </w:p>
     <w:p>
@@ -2671,71 +2216,79 @@
         <w:pStyle w:val="Compact"/>
       </w:pPr>
       <w:r>
-        <w:rPr>
-          <w:bCs/>
-          <w:b/>
-        </w:rPr>
-        <w:t xml:space="preserve">Creatine-kit page:</w:t>
-      </w:r>
-      <w:r>
-        <w:t xml:space="preserve"> </w:t>
-      </w:r>
-      <w:r>
-        <w:t xml:space="preserve">open /products/muto-nad-cellular-complex?view=muto-nad-creatine-kit.</w:t>
-      </w:r>
-    </w:p>
-    <w:p>
-      <w:pPr>
-        <w:numPr>
-          <w:ilvl w:val="1"/>
-          <w:numId w:val="1006"/>
-        </w:numPr>
-        <w:pStyle w:val="Compact"/>
-      </w:pPr>
-      <w:r>
-        <w:t xml:space="preserve">Five kit images sit on one row, under the itemised list.</w:t>
-      </w:r>
-    </w:p>
-    <w:p>
-      <w:pPr>
-        <w:numPr>
-          <w:ilvl w:val="1"/>
-          <w:numId w:val="1006"/>
-        </w:numPr>
-        <w:pStyle w:val="Compact"/>
-      </w:pPr>
-      <w:r>
-        <w:t xml:space="preserve">Each pop-up opens and closes.</w:t>
-      </w:r>
-    </w:p>
-    <w:p>
-      <w:pPr>
-        <w:numPr>
-          <w:ilvl w:val="1"/>
-          <w:numId w:val="1006"/>
-        </w:numPr>
-        <w:pStyle w:val="Compact"/>
-      </w:pPr>
-      <w:r>
-        <w:t xml:space="preserve">On a phone,</w:t>
-      </w:r>
-      <w:r>
-        <w:t xml:space="preserve"> </w:t>
-      </w:r>
-      <w:r>
+        <w:t xml:space="preserve">☐</w:t>
+      </w:r>
+      <w:r>
+        <w:t xml:space="preserve"> </w:t>
+      </w:r>
+      <w:r>
+        <w:rPr>
+          <w:bCs/>
+          <w:b/>
+        </w:rPr>
         <w:t xml:space="preserve">“</w:t>
       </w:r>
       <w:r>
+        <w:rPr>
+          <w:bCs/>
+          <w:b/>
+        </w:rPr>
         <w:t xml:space="preserve">No commitment</w:t>
       </w:r>
       <w:r>
+        <w:rPr>
+          <w:bCs/>
+          <w:b/>
+        </w:rPr>
         <w:t xml:space="preserve">”</w:t>
       </w:r>
       <w:r>
-        <w:t xml:space="preserve"> </w:t>
-      </w:r>
-      <w:r>
-        <w:t xml:space="preserve">appears as the fourth point in a 2×2 grid. On desktop it’s hidden.</w:t>
+        <w:rPr>
+          <w:bCs/>
+          <w:b/>
+        </w:rPr>
+        <w:t xml:space="preserve"> </w:t>
+      </w:r>
+      <w:r>
+        <w:rPr>
+          <w:bCs/>
+          <w:b/>
+        </w:rPr>
+        <w:t xml:space="preserve">and</w:t>
+      </w:r>
+      <w:r>
+        <w:rPr>
+          <w:bCs/>
+          <w:b/>
+        </w:rPr>
+        <w:t xml:space="preserve"> </w:t>
+      </w:r>
+      <w:r>
+        <w:rPr>
+          <w:bCs/>
+          <w:b/>
+        </w:rPr>
+        <w:t xml:space="preserve">“</w:t>
+      </w:r>
+      <w:r>
+        <w:rPr>
+          <w:bCs/>
+          <w:b/>
+        </w:rPr>
+        <w:t xml:space="preserve">Skip or cancel anytime</w:t>
+      </w:r>
+      <w:r>
+        <w:rPr>
+          <w:bCs/>
+          <w:b/>
+        </w:rPr>
+        <w:t xml:space="preserve">”</w:t>
+      </w:r>
+      <w:r>
+        <w:t xml:space="preserve"> </w:t>
+      </w:r>
+      <w:r>
+        <w:t xml:space="preserve">say much the same thing on phones. Keep both, or drop one.</w:t>
       </w:r>
     </w:p>
     <w:p>
@@ -2747,35 +2300,37 @@
         <w:pStyle w:val="Compact"/>
       </w:pPr>
       <w:r>
-        <w:rPr>
-          <w:bCs/>
-          <w:b/>
-        </w:rPr>
-        <w:t xml:space="preserve">Simple page:</w:t>
-      </w:r>
-      <w:r>
-        <w:t xml:space="preserve"> </w:t>
-      </w:r>
-      <w:r>
-        <w:t xml:space="preserve">/products/muto-nad-cellular-complex?view=muto-nad-simple shows the same plans as the normal page (no</w:t>
-      </w:r>
-      <w:r>
-        <w:t xml:space="preserve"> </w:t>
-      </w:r>
-      <w:r>
+        <w:t xml:space="preserve">☐</w:t>
+      </w:r>
+      <w:r>
+        <w:t xml:space="preserve"> </w:t>
+      </w:r>
+      <w:r>
+        <w:rPr>
+          <w:bCs/>
+          <w:b/>
+        </w:rPr>
         <w:t xml:space="preserve">“</w:t>
       </w:r>
       <w:r>
-        <w:t xml:space="preserve">3 months £135</w:t>
-      </w:r>
-      <w:r>
+        <w:rPr>
+          <w:bCs/>
+          <w:b/>
+        </w:rPr>
+        <w:t xml:space="preserve">Free gifts worth £249</w:t>
+      </w:r>
+      <w:r>
+        <w:rPr>
+          <w:bCs/>
+          <w:b/>
+        </w:rPr>
         <w:t xml:space="preserve">”</w:t>
       </w:r>
       <w:r>
         <w:t xml:space="preserve"> </w:t>
       </w:r>
       <w:r>
-        <w:t xml:space="preserve">card).</w:t>
+        <w:t xml:space="preserve">(plans banner, same as live) was set before creatine (£30) joined the first-order kit. Check the figure on the creatine-kit page.</w:t>
       </w:r>
     </w:p>
     <w:p>
@@ -2787,6 +2342,734 @@
         <w:pStyle w:val="Compact"/>
       </w:pPr>
       <w:r>
+        <w:t xml:space="preserve">☐</w:t>
+      </w:r>
+      <w:r>
+        <w:t xml:space="preserve"> </w:t>
+      </w:r>
+      <w:r>
+        <w:rPr>
+          <w:bCs/>
+          <w:b/>
+        </w:rPr>
+        <w:t xml:space="preserve">Creatine at later orders:</w:t>
+      </w:r>
+      <w:r>
+        <w:t xml:space="preserve"> </w:t>
+      </w:r>
+      <w:r>
+        <w:t xml:space="preserve">creatine is still the gift at orders 4 and 6 (as on live) and now also in the first-order kit. Confirm that’s intended.</w:t>
+      </w:r>
+    </w:p>
+    <w:p>
+      <w:pPr>
+        <w:numPr>
+          <w:ilvl w:val="0"/>
+          <w:numId w:val="1005"/>
+        </w:numPr>
+        <w:pStyle w:val="Compact"/>
+      </w:pPr>
+      <w:r>
+        <w:t xml:space="preserve">☐</w:t>
+      </w:r>
+      <w:r>
+        <w:t xml:space="preserve"> </w:t>
+      </w:r>
+      <w:r>
+        <w:rPr>
+          <w:bCs/>
+          <w:b/>
+        </w:rPr>
+        <w:t xml:space="preserve">Refund policy</w:t>
+      </w:r>
+      <w:r>
+        <w:t xml:space="preserve"> </w:t>
+      </w:r>
+      <w:r>
+        <w:t xml:space="preserve">(Settings → Policies) still describes a 30-day guarantee with a wearable export. Rewrite it to the FAQ terms: 90 days, first-time subscribers at muto.co, less delivery costs, claim within 14 days after the 90 days end, wearable data optional.</w:t>
+      </w:r>
+    </w:p>
+    <w:p>
+      <w:pPr>
+        <w:numPr>
+          <w:ilvl w:val="0"/>
+          <w:numId w:val="1005"/>
+        </w:numPr>
+        <w:pStyle w:val="Compact"/>
+      </w:pPr>
+      <w:r>
+        <w:t xml:space="preserve">☐</w:t>
+      </w:r>
+      <w:r>
+        <w:t xml:space="preserve"> </w:t>
+      </w:r>
+      <w:r>
+        <w:rPr>
+          <w:bCs/>
+          <w:b/>
+        </w:rPr>
+        <w:t xml:space="preserve">“</w:t>
+      </w:r>
+      <w:r>
+        <w:rPr>
+          <w:bCs/>
+          <w:b/>
+        </w:rPr>
+        <w:t xml:space="preserve">Full refund</w:t>
+      </w:r>
+      <w:r>
+        <w:rPr>
+          <w:bCs/>
+          <w:b/>
+        </w:rPr>
+        <w:t xml:space="preserve">”</w:t>
+      </w:r>
+      <w:r>
+        <w:rPr>
+          <w:bCs/>
+          <w:b/>
+        </w:rPr>
+        <w:t xml:space="preserve"> </w:t>
+      </w:r>
+      <w:r>
+        <w:rPr>
+          <w:bCs/>
+          <w:b/>
+        </w:rPr>
+        <w:t xml:space="preserve">wording</w:t>
+      </w:r>
+      <w:r>
+        <w:t xml:space="preserve"> </w:t>
+      </w:r>
+      <w:r>
+        <w:t xml:space="preserve">on the NAD+ product page: the</w:t>
+      </w:r>
+      <w:r>
+        <w:t xml:space="preserve"> </w:t>
+      </w:r>
+      <w:r>
+        <w:t xml:space="preserve">“</w:t>
+      </w:r>
+      <w:r>
+        <w:t xml:space="preserve">90-Day Money back Guarantee</w:t>
+      </w:r>
+      <w:r>
+        <w:t xml:space="preserve">”</w:t>
+      </w:r>
+      <w:r>
+        <w:t xml:space="preserve"> </w:t>
+      </w:r>
+      <w:r>
+        <w:t xml:space="preserve">accordion and the guarantee section say</w:t>
+      </w:r>
+      <w:r>
+        <w:t xml:space="preserve"> </w:t>
+      </w:r>
+      <w:r>
+        <w:t xml:space="preserve">“</w:t>
+      </w:r>
+      <w:r>
+        <w:t xml:space="preserve">in full</w:t>
+      </w:r>
+      <w:r>
+        <w:t xml:space="preserve">”</w:t>
+      </w:r>
+      <w:r>
+        <w:t xml:space="preserve">. The FAQ says</w:t>
+      </w:r>
+      <w:r>
+        <w:t xml:space="preserve"> </w:t>
+      </w:r>
+      <w:r>
+        <w:t xml:space="preserve">“</w:t>
+      </w:r>
+      <w:r>
+        <w:t xml:space="preserve">less our delivery costs</w:t>
+      </w:r>
+      <w:r>
+        <w:t xml:space="preserve">”</w:t>
+      </w:r>
+      <w:r>
+        <w:t xml:space="preserve">.</w:t>
+      </w:r>
+    </w:p>
+    <w:p>
+      <w:pPr>
+        <w:numPr>
+          <w:ilvl w:val="0"/>
+          <w:numId w:val="1005"/>
+        </w:numPr>
+        <w:pStyle w:val="Compact"/>
+      </w:pPr>
+      <w:r>
+        <w:t xml:space="preserve">☐</w:t>
+      </w:r>
+      <w:r>
+        <w:t xml:space="preserve"> </w:t>
+      </w:r>
+      <w:r>
+        <w:rPr>
+          <w:bCs/>
+          <w:b/>
+        </w:rPr>
+        <w:t xml:space="preserve">“</w:t>
+      </w:r>
+      <w:r>
+        <w:rPr>
+          <w:bCs/>
+          <w:b/>
+        </w:rPr>
+        <w:t xml:space="preserve">Pre-Order Now - Arrives 15/10</w:t>
+      </w:r>
+      <w:r>
+        <w:rPr>
+          <w:bCs/>
+          <w:b/>
+        </w:rPr>
+        <w:t xml:space="preserve">”</w:t>
+      </w:r>
+      <w:r>
+        <w:t xml:space="preserve"> </w:t>
+      </w:r>
+      <w:r>
+        <w:t xml:space="preserve">is hard-coded in the Add to Cart button in</w:t>
+      </w:r>
+      <w:r>
+        <w:t xml:space="preserve"> </w:t>
+      </w:r>
+      <w:r>
+        <w:rPr>
+          <w:rStyle w:val="VerbatimChar"/>
+        </w:rPr>
+        <w:t xml:space="preserve">muto-crea-buy.liquid</w:t>
+      </w:r>
+      <w:r>
+        <w:t xml:space="preserve">, not a setting. Remove it after 15 Oct.</w:t>
+      </w:r>
+    </w:p>
+    <w:p>
+      <w:pPr>
+        <w:numPr>
+          <w:ilvl w:val="0"/>
+          <w:numId w:val="1005"/>
+        </w:numPr>
+        <w:pStyle w:val="Compact"/>
+      </w:pPr>
+      <w:r>
+        <w:t xml:space="preserve">☐</w:t>
+      </w:r>
+      <w:r>
+        <w:t xml:space="preserve"> </w:t>
+      </w:r>
+      <w:r>
+        <w:rPr>
+          <w:bCs/>
+          <w:b/>
+        </w:rPr>
+        <w:t xml:space="preserve">Product search description</w:t>
+      </w:r>
+      <w:r>
+        <w:t xml:space="preserve"> </w:t>
+      </w:r>
+      <w:r>
+        <w:t xml:space="preserve">(SEO) still says</w:t>
+      </w:r>
+      <w:r>
+        <w:t xml:space="preserve"> </w:t>
+      </w:r>
+      <w:r>
+        <w:t xml:space="preserve">“</w:t>
+      </w:r>
+      <w:r>
+        <w:t xml:space="preserve">stress resilience</w:t>
+      </w:r>
+      <w:r>
+        <w:t xml:space="preserve">”</w:t>
+      </w:r>
+      <w:r>
+        <w:t xml:space="preserve">.</w:t>
+      </w:r>
+    </w:p>
+    <w:p>
+      <w:pPr>
+        <w:numPr>
+          <w:ilvl w:val="0"/>
+          <w:numId w:val="1005"/>
+        </w:numPr>
+        <w:pStyle w:val="Compact"/>
+      </w:pPr>
+      <w:r>
+        <w:t xml:space="preserve">☐</w:t>
+      </w:r>
+      <w:r>
+        <w:t xml:space="preserve"> </w:t>
+      </w:r>
+      <w:r>
+        <w:rPr>
+          <w:bCs/>
+          <w:b/>
+        </w:rPr>
+        <w:t xml:space="preserve">“</w:t>
+      </w:r>
+      <w:r>
+        <w:rPr>
+          <w:bCs/>
+          <w:b/>
+        </w:rPr>
+        <w:t xml:space="preserve">300+ supporting studies</w:t>
+      </w:r>
+      <w:r>
+        <w:rPr>
+          <w:bCs/>
+          <w:b/>
+        </w:rPr>
+        <w:t xml:space="preserve">”</w:t>
+      </w:r>
+      <w:r>
+        <w:t xml:space="preserve"> </w:t>
+      </w:r>
+      <w:r>
+        <w:t xml:space="preserve">stat on the home page: flagged in the FAQ brief as unsupported.</w:t>
+      </w:r>
+    </w:p>
+    <w:p>
+      <w:pPr>
+        <w:numPr>
+          <w:ilvl w:val="0"/>
+          <w:numId w:val="1005"/>
+        </w:numPr>
+        <w:pStyle w:val="Compact"/>
+      </w:pPr>
+      <w:r>
+        <w:t xml:space="preserve">☐</w:t>
+      </w:r>
+      <w:r>
+        <w:t xml:space="preserve"> </w:t>
+      </w:r>
+      <w:r>
+        <w:rPr>
+          <w:bCs/>
+          <w:b/>
+        </w:rPr>
+        <w:t xml:space="preserve">/pages/muto-home</w:t>
+      </w:r>
+      <w:r>
+        <w:t xml:space="preserve"> </w:t>
+      </w:r>
+      <w:r>
+        <w:t xml:space="preserve">still has the old buttons (</w:t>
+      </w:r>
+      <w:r>
+        <w:t xml:space="preserve">“</w:t>
+      </w:r>
+      <w:r>
+        <w:t xml:space="preserve">Start your 90 days</w:t>
+      </w:r>
+      <w:r>
+        <w:t xml:space="preserve">”</w:t>
+      </w:r>
+      <w:r>
+        <w:t xml:space="preserve">,</w:t>
+      </w:r>
+      <w:r>
+        <w:t xml:space="preserve"> </w:t>
+      </w:r>
+      <w:r>
+        <w:t xml:space="preserve">“</w:t>
+      </w:r>
+      <w:r>
+        <w:t xml:space="preserve">Start Today</w:t>
+      </w:r>
+      <w:r>
+        <w:t xml:space="preserve">”</w:t>
+      </w:r>
+      <w:r>
+        <w:t xml:space="preserve">,</w:t>
+      </w:r>
+      <w:r>
+        <w:t xml:space="preserve"> </w:t>
+      </w:r>
+      <w:r>
+        <w:t xml:space="preserve">“</w:t>
+      </w:r>
+      <w:r>
+        <w:t xml:space="preserve">Coming Soon</w:t>
+      </w:r>
+      <w:r>
+        <w:t xml:space="preserve">”</w:t>
+      </w:r>
+      <w:r>
+        <w:t xml:space="preserve">),</w:t>
+      </w:r>
+      <w:r>
+        <w:t xml:space="preserve"> </w:t>
+      </w:r>
+      <w:r>
+        <w:t xml:space="preserve">“</w:t>
+      </w:r>
+      <w:r>
+        <w:t xml:space="preserve">seven scientists</w:t>
+      </w:r>
+      <w:r>
+        <w:t xml:space="preserve">”</w:t>
+      </w:r>
+      <w:r>
+        <w:t xml:space="preserve"> </w:t>
+      </w:r>
+      <w:r>
+        <w:t xml:space="preserve">and the</w:t>
+      </w:r>
+      <w:r>
+        <w:t xml:space="preserve"> </w:t>
+      </w:r>
+      <w:r>
+        <w:t xml:space="preserve">“</w:t>
+      </w:r>
+      <w:r>
+        <w:t xml:space="preserve">7 advisors</w:t>
+      </w:r>
+      <w:r>
+        <w:t xml:space="preserve">”</w:t>
+      </w:r>
+      <w:r>
+        <w:t xml:space="preserve"> </w:t>
+      </w:r>
+      <w:r>
+        <w:t xml:space="preserve">stat.</w:t>
+      </w:r>
+    </w:p>
+    <w:p>
+      <w:pPr>
+        <w:numPr>
+          <w:ilvl w:val="0"/>
+          <w:numId w:val="1005"/>
+        </w:numPr>
+        <w:pStyle w:val="Compact"/>
+      </w:pPr>
+      <w:r>
+        <w:t xml:space="preserve">☐</w:t>
+      </w:r>
+      <w:r>
+        <w:t xml:space="preserve"> </w:t>
+      </w:r>
+      <w:r>
+        <w:rPr>
+          <w:bCs/>
+          <w:b/>
+        </w:rPr>
+        <w:t xml:space="preserve">CoQ10 form on the home page:</w:t>
+      </w:r>
+      <w:r>
+        <w:t xml:space="preserve"> </w:t>
+      </w:r>
+      <w:r>
+        <w:t xml:space="preserve">the science Formula tab and</w:t>
+      </w:r>
+      <w:r>
+        <w:t xml:space="preserve"> </w:t>
+      </w:r>
+      <w:r>
+        <w:t xml:space="preserve">“</w:t>
+      </w:r>
+      <w:r>
+        <w:t xml:space="preserve">What’s inside</w:t>
+      </w:r>
+      <w:r>
+        <w:t xml:space="preserve">”</w:t>
+      </w:r>
+      <w:r>
+        <w:t xml:space="preserve"> </w:t>
+      </w:r>
+      <w:r>
+        <w:t xml:space="preserve">say plain</w:t>
+      </w:r>
+      <w:r>
+        <w:t xml:space="preserve"> </w:t>
+      </w:r>
+      <w:r>
+        <w:t xml:space="preserve">“</w:t>
+      </w:r>
+      <w:r>
+        <w:t xml:space="preserve">CoQ10</w:t>
+      </w:r>
+      <w:r>
+        <w:t xml:space="preserve">”</w:t>
+      </w:r>
+      <w:r>
+        <w:t xml:space="preserve">; the FAQ table says Ubiquinone. Confirm whether the home page should say</w:t>
+      </w:r>
+      <w:r>
+        <w:t xml:space="preserve"> </w:t>
+      </w:r>
+      <w:r>
+        <w:t xml:space="preserve">“</w:t>
+      </w:r>
+      <w:r>
+        <w:t xml:space="preserve">(as ubiquinone)</w:t>
+      </w:r>
+      <w:r>
+        <w:t xml:space="preserve">”</w:t>
+      </w:r>
+      <w:r>
+        <w:t xml:space="preserve">.</w:t>
+      </w:r>
+    </w:p>
+    <w:p>
+      <w:pPr>
+        <w:numPr>
+          <w:ilvl w:val="0"/>
+          <w:numId w:val="1005"/>
+        </w:numPr>
+        <w:pStyle w:val="Compact"/>
+      </w:pPr>
+      <w:r>
+        <w:t xml:space="preserve">☐</w:t>
+      </w:r>
+      <w:r>
+        <w:t xml:space="preserve"> </w:t>
+      </w:r>
+      <w:r>
+        <w:rPr>
+          <w:bCs/>
+          <w:b/>
+        </w:rPr>
+        <w:t xml:space="preserve">Claims review:</w:t>
+      </w:r>
+      <w:r>
+        <w:t xml:space="preserve"> </w:t>
+      </w:r>
+      <w:r>
+        <w:t xml:space="preserve">vitamin K2 sits under the immunity and muscle claims in the science Formula tab, product description and FAQ, but has no authorised claim for either.</w:t>
+      </w:r>
+    </w:p>
+    <w:p>
+      <w:pPr>
+        <w:numPr>
+          <w:ilvl w:val="0"/>
+          <w:numId w:val="1005"/>
+        </w:numPr>
+        <w:pStyle w:val="Compact"/>
+      </w:pPr>
+      <w:r>
+        <w:t xml:space="preserve">☐</w:t>
+      </w:r>
+      <w:r>
+        <w:t xml:space="preserve"> </w:t>
+      </w:r>
+      <w:r>
+        <w:rPr>
+          <w:bCs/>
+          <w:b/>
+        </w:rPr>
+        <w:t xml:space="preserve">Plan per-day prices:</w:t>
+      </w:r>
+      <w:r>
+        <w:t xml:space="preserve"> </w:t>
+      </w:r>
+      <w:r>
+        <w:t xml:space="preserve">live says</w:t>
+      </w:r>
+      <w:r>
+        <w:t xml:space="preserve"> </w:t>
+      </w:r>
+      <w:r>
+        <w:t xml:space="preserve">“</w:t>
+      </w:r>
+      <w:r>
+        <w:t xml:space="preserve">£2/day</w:t>
+      </w:r>
+      <w:r>
+        <w:t xml:space="preserve">”</w:t>
+      </w:r>
+      <w:r>
+        <w:t xml:space="preserve">, but £60 every 4 weeks is about £2.14 a day.</w:t>
+      </w:r>
+    </w:p>
+    <w:p>
+      <w:pPr>
+        <w:numPr>
+          <w:ilvl w:val="0"/>
+          <w:numId w:val="1005"/>
+        </w:numPr>
+        <w:pStyle w:val="Compact"/>
+      </w:pPr>
+      <w:r>
+        <w:t xml:space="preserve">☐</w:t>
+      </w:r>
+      <w:r>
+        <w:t xml:space="preserve"> </w:t>
+      </w:r>
+      <w:r>
+        <w:rPr>
+          <w:bCs/>
+          <w:b/>
+        </w:rPr>
+        <w:t xml:space="preserve">Informed Sport:</w:t>
+      </w:r>
+      <w:r>
+        <w:t xml:space="preserve"> </w:t>
+      </w:r>
+      <w:r>
+        <w:t xml:space="preserve">swap the drug-tested athletes FAQ answer when certification is live (the certified wording is in MUTO_FAQ_Page_Final_Oct26.docx).</w:t>
+      </w:r>
+    </w:p>
+    <w:bookmarkEnd w:id="28"/>
+    <w:bookmarkStart w:id="30" w:name="check-after-publishing"/>
+    <w:p>
+      <w:pPr>
+        <w:pStyle w:val="Heading1"/>
+      </w:pPr>
+      <w:r>
+        <w:t xml:space="preserve">Check after publishing</w:t>
+      </w:r>
+    </w:p>
+    <w:p>
+      <w:pPr>
+        <w:numPr>
+          <w:ilvl w:val="0"/>
+          <w:numId w:val="1006"/>
+        </w:numPr>
+        <w:pStyle w:val="Compact"/>
+      </w:pPr>
+      <w:r>
+        <w:rPr>
+          <w:bCs/>
+          <w:b/>
+        </w:rPr>
+        <w:t xml:space="preserve">NAD+ product page:</w:t>
+      </w:r>
+      <w:r>
+        <w:t xml:space="preserve"> </w:t>
+      </w:r>
+      <w:r>
+        <w:t xml:space="preserve">the gallery shows the 3 images from the product’s Media in admin. Everything else looks as it does today: no itemised list, the ticked rows are still there, the review card still rotates, and plan picking still works (the duplicate-option fix is kept).</w:t>
+      </w:r>
+    </w:p>
+    <w:p>
+      <w:pPr>
+        <w:numPr>
+          <w:ilvl w:val="0"/>
+          <w:numId w:val="1006"/>
+        </w:numPr>
+        <w:pStyle w:val="Compact"/>
+      </w:pPr>
+      <w:r>
+        <w:rPr>
+          <w:bCs/>
+          <w:b/>
+        </w:rPr>
+        <w:t xml:space="preserve">Creatine-kit page:</w:t>
+      </w:r>
+      <w:r>
+        <w:t xml:space="preserve"> </w:t>
+      </w:r>
+      <w:r>
+        <w:t xml:space="preserve">open /products/muto-nad-cellular-complex?view=muto-nad-creatine-kit.</w:t>
+      </w:r>
+    </w:p>
+    <w:p>
+      <w:pPr>
+        <w:numPr>
+          <w:ilvl w:val="1"/>
+          <w:numId w:val="1007"/>
+        </w:numPr>
+        <w:pStyle w:val="Compact"/>
+      </w:pPr>
+      <w:r>
+        <w:t xml:space="preserve">Five kit images sit on one row, under the itemised list.</w:t>
+      </w:r>
+    </w:p>
+    <w:p>
+      <w:pPr>
+        <w:numPr>
+          <w:ilvl w:val="1"/>
+          <w:numId w:val="1007"/>
+        </w:numPr>
+        <w:pStyle w:val="Compact"/>
+      </w:pPr>
+      <w:r>
+        <w:t xml:space="preserve">Each pop-up opens and closes.</w:t>
+      </w:r>
+    </w:p>
+    <w:p>
+      <w:pPr>
+        <w:numPr>
+          <w:ilvl w:val="1"/>
+          <w:numId w:val="1007"/>
+        </w:numPr>
+        <w:pStyle w:val="Compact"/>
+      </w:pPr>
+      <w:r>
+        <w:t xml:space="preserve">On a phone,</w:t>
+      </w:r>
+      <w:r>
+        <w:t xml:space="preserve"> </w:t>
+      </w:r>
+      <w:r>
+        <w:t xml:space="preserve">“</w:t>
+      </w:r>
+      <w:r>
+        <w:t xml:space="preserve">No commitment</w:t>
+      </w:r>
+      <w:r>
+        <w:t xml:space="preserve">”</w:t>
+      </w:r>
+      <w:r>
+        <w:t xml:space="preserve"> </w:t>
+      </w:r>
+      <w:r>
+        <w:t xml:space="preserve">appears as the fourth point in a 2×2 grid. On desktop it’s hidden.</w:t>
+      </w:r>
+    </w:p>
+    <w:p>
+      <w:pPr>
+        <w:numPr>
+          <w:ilvl w:val="0"/>
+          <w:numId w:val="1006"/>
+        </w:numPr>
+        <w:pStyle w:val="Compact"/>
+      </w:pPr>
+      <w:r>
+        <w:rPr>
+          <w:bCs/>
+          <w:b/>
+        </w:rPr>
+        <w:t xml:space="preserve">Simple page:</w:t>
+      </w:r>
+      <w:r>
+        <w:t xml:space="preserve"> </w:t>
+      </w:r>
+      <w:r>
+        <w:t xml:space="preserve">/products/muto-nad-cellular-complex?view=muto-nad-simple shows the same plans as the normal page (no</w:t>
+      </w:r>
+      <w:r>
+        <w:t xml:space="preserve"> </w:t>
+      </w:r>
+      <w:r>
+        <w:t xml:space="preserve">“</w:t>
+      </w:r>
+      <w:r>
+        <w:t xml:space="preserve">3 months £135</w:t>
+      </w:r>
+      <w:r>
+        <w:t xml:space="preserve">”</w:t>
+      </w:r>
+      <w:r>
+        <w:t xml:space="preserve"> </w:t>
+      </w:r>
+      <w:r>
+        <w:t xml:space="preserve">card).</w:t>
+      </w:r>
+    </w:p>
+    <w:p>
+      <w:pPr>
+        <w:numPr>
+          <w:ilvl w:val="0"/>
+          <w:numId w:val="1006"/>
+        </w:numPr>
+        <w:pStyle w:val="Compact"/>
+      </w:pPr>
+      <w:r>
         <w:rPr>
           <w:bCs/>
           <w:b/>
@@ -2826,7 +3109,7 @@
       <w:r>
         <w:t xml:space="preserve">. Run it through Google’s Rich Results Test (</w:t>
       </w:r>
-      <w:hyperlink r:id="rId28">
+      <w:hyperlink r:id="rId29">
         <w:r>
           <w:rPr>
             <w:rStyle w:val="Hyperlink"/>
@@ -2842,7 +3125,7 @@
       <w:pPr>
         <w:numPr>
           <w:ilvl w:val="0"/>
-          <w:numId w:val="1005"/>
+          <w:numId w:val="1006"/>
         </w:numPr>
         <w:pStyle w:val="Compact"/>
       </w:pPr>
@@ -2896,7 +3179,7 @@
         <w:t xml:space="preserve">label.</w:t>
       </w:r>
     </w:p>
-    <w:bookmarkEnd w:id="29"/>
+    <w:bookmarkEnd w:id="30"/>
     <w:sectPr/>
   </w:body>
 </w:document>
@@ -3180,6 +3463,9 @@
     <w:abstractNumId w:val="991"/>
   </w:num>
   <w:num w:numId="1005">
+    <w:abstractNumId w:val="991"/>
+  </w:num>
+  <w:num w:numId="1006">
     <w:abstractNumId w:val="99411"/>
     <w:lvlOverride w:ilvl="0">
       <w:startOverride w:val="1"/>
@@ -3209,7 +3495,7 @@
       <w:startOverride w:val="1"/>
     </w:lvlOverride>
   </w:num>
-  <w:num w:numId="1006">
+  <w:num w:numId="1007">
     <w:abstractNumId w:val="991"/>
   </w:num>
 </w:numbering>

</xml_diff>